<commit_message>
Fixed lost proposed role in the previous version
</commit_message>
<xml_diff>
--- a/Group07_VehicleRegistrationAuthority_Proposal.docx
+++ b/Group07_VehicleRegistrationAuthority_Proposal.docx
@@ -594,6 +594,9 @@
             <w:pPr>
               <w:jc w:val="center"/>
             </w:pPr>
+            <w:r>
+              <w:t>Group Leader</w:t>
+            </w:r>
           </w:p>
         </w:tc>
         <w:tc>
@@ -673,6 +676,9 @@
             <w:pPr>
               <w:jc w:val="center"/>
             </w:pPr>
+            <w:r>
+              <w:t>Query Developer</w:t>
+            </w:r>
           </w:p>
         </w:tc>
         <w:tc>
@@ -747,6 +753,9 @@
             <w:pPr>
               <w:jc w:val="center"/>
             </w:pPr>
+            <w:r>
+              <w:t>Tester and Writer</w:t>
+            </w:r>
           </w:p>
         </w:tc>
         <w:tc>
@@ -821,6 +830,9 @@
             <w:pPr>
               <w:jc w:val="center"/>
             </w:pPr>
+            <w:r>
+              <w:t>Java Developer</w:t>
+            </w:r>
           </w:p>
         </w:tc>
         <w:tc>
@@ -900,6 +912,9 @@
             <w:pPr>
               <w:jc w:val="center"/>
             </w:pPr>
+            <w:r>
+              <w:t>Normalization Lead</w:t>
+            </w:r>
           </w:p>
         </w:tc>
         <w:tc>
@@ -979,6 +994,9 @@
             <w:pPr>
               <w:jc w:val="center"/>
             </w:pPr>
+            <w:r>
+              <w:t>Java Developer</w:t>
+            </w:r>
           </w:p>
         </w:tc>
         <w:tc>
@@ -1053,6 +1071,9 @@
             <w:pPr>
               <w:jc w:val="center"/>
             </w:pPr>
+            <w:r>
+              <w:t>Database Developer</w:t>
+            </w:r>
           </w:p>
         </w:tc>
         <w:tc>
@@ -1135,6 +1156,9 @@
             <w:pPr>
               <w:jc w:val="center"/>
             </w:pPr>
+            <w:r>
+              <w:t>Database Developer</w:t>
+            </w:r>
           </w:p>
         </w:tc>
         <w:tc>
@@ -1217,6 +1241,9 @@
             <w:pPr>
               <w:jc w:val="center"/>
             </w:pPr>
+            <w:r>
+              <w:t>Query Developer</w:t>
+            </w:r>
           </w:p>
         </w:tc>
         <w:tc>
@@ -1291,6 +1318,9 @@
             <w:pPr>
               <w:jc w:val="center"/>
             </w:pPr>
+            <w:r>
+              <w:t>Normalization Lead</w:t>
+            </w:r>
           </w:p>
         </w:tc>
         <w:tc>
@@ -1365,6 +1395,9 @@
             <w:pPr>
               <w:jc w:val="center"/>
             </w:pPr>
+            <w:r>
+              <w:t>Database Modeler</w:t>
+            </w:r>
           </w:p>
         </w:tc>
         <w:tc>
@@ -1452,6 +1485,9 @@
             <w:pPr>
               <w:jc w:val="center"/>
             </w:pPr>
+            <w:r>
+              <w:t>Java Developer</w:t>
+            </w:r>
           </w:p>
         </w:tc>
         <w:tc>
@@ -1526,6 +1562,9 @@
             <w:pPr>
               <w:jc w:val="center"/>
             </w:pPr>
+            <w:r>
+              <w:t>Database Modeler</w:t>
+            </w:r>
           </w:p>
         </w:tc>
         <w:tc>

</xml_diff>